<commit_message>
Assignment 2 Task1 track
</commit_message>
<xml_diff>
--- a/Documentation.docx
+++ b/Documentation.docx
@@ -278,13 +278,23 @@
                       <w:szCs w:val="22"/>
                     </w:rPr>
                   </w:pPr>
+                  <w:proofErr w:type="spellStart"/>
                   <w:r>
                     <w:rPr>
                       <w:color w:val="000000"/>
                       <w:sz w:val="22"/>
                       <w:szCs w:val="22"/>
                     </w:rPr>
-                    <w:t>Azfar Adnan - 241980037</w:t>
+                    <w:t>Azfar</w:t>
+                  </w:r>
+                  <w:proofErr w:type="spellEnd"/>
+                  <w:r>
+                    <w:rPr>
+                      <w:color w:val="000000"/>
+                      <w:sz w:val="22"/>
+                      <w:szCs w:val="22"/>
+                    </w:rPr>
+                    <w:t xml:space="preserve"> Adnan - 241980037</w:t>
                   </w:r>
                 </w:p>
                 <w:p>
@@ -313,13 +323,23 @@
                       <w:szCs w:val="22"/>
                     </w:rPr>
                   </w:pPr>
+                  <w:proofErr w:type="spellStart"/>
                   <w:r>
                     <w:rPr>
                       <w:color w:val="000000"/>
                       <w:sz w:val="22"/>
                       <w:szCs w:val="22"/>
                     </w:rPr>
-                    <w:t>Sayam - 241980044</w:t>
+                    <w:t>Sayam</w:t>
+                  </w:r>
+                  <w:proofErr w:type="spellEnd"/>
+                  <w:r>
+                    <w:rPr>
+                      <w:color w:val="000000"/>
+                      <w:sz w:val="22"/>
+                      <w:szCs w:val="22"/>
+                    </w:rPr>
+                    <w:t xml:space="preserve"> - 241980044</w:t>
                   </w:r>
                 </w:p>
               </w:txbxContent>
@@ -440,12 +460,14 @@
           <w:rFonts w:ascii="Times New Roman" w:hAnsi="Times New Roman" w:cs="Times New Roman"/>
         </w:rPr>
       </w:pPr>
+      <w:proofErr w:type="spellStart"/>
       <w:r>
         <w:rPr>
           <w:rFonts w:ascii="Times New Roman" w:hAnsi="Times New Roman" w:cs="Times New Roman"/>
         </w:rPr>
         <w:t>person_age</w:t>
       </w:r>
+      <w:proofErr w:type="spellEnd"/>
     </w:p>
     <w:p>
       <w:pPr>
@@ -458,12 +480,14 @@
           <w:rFonts w:ascii="Times New Roman" w:hAnsi="Times New Roman" w:cs="Times New Roman"/>
         </w:rPr>
       </w:pPr>
+      <w:proofErr w:type="spellStart"/>
       <w:r>
         <w:rPr>
           <w:rFonts w:ascii="Times New Roman" w:hAnsi="Times New Roman" w:cs="Times New Roman"/>
         </w:rPr>
         <w:t>person_gender</w:t>
       </w:r>
+      <w:proofErr w:type="spellEnd"/>
     </w:p>
     <w:p>
       <w:pPr>
@@ -476,12 +500,14 @@
           <w:rFonts w:ascii="Times New Roman" w:hAnsi="Times New Roman" w:cs="Times New Roman"/>
         </w:rPr>
       </w:pPr>
+      <w:proofErr w:type="spellStart"/>
       <w:r>
         <w:rPr>
           <w:rFonts w:ascii="Times New Roman" w:hAnsi="Times New Roman" w:cs="Times New Roman"/>
         </w:rPr>
         <w:t>person_education</w:t>
       </w:r>
+      <w:proofErr w:type="spellEnd"/>
     </w:p>
     <w:p>
       <w:pPr>
@@ -494,12 +520,14 @@
           <w:rFonts w:ascii="Times New Roman" w:hAnsi="Times New Roman" w:cs="Times New Roman"/>
         </w:rPr>
       </w:pPr>
+      <w:proofErr w:type="spellStart"/>
       <w:r>
         <w:rPr>
           <w:rFonts w:ascii="Times New Roman" w:hAnsi="Times New Roman" w:cs="Times New Roman"/>
         </w:rPr>
         <w:t>person_income</w:t>
       </w:r>
+      <w:proofErr w:type="spellEnd"/>
     </w:p>
     <w:p>
       <w:pPr>
@@ -512,12 +540,14 @@
           <w:rFonts w:ascii="Times New Roman" w:hAnsi="Times New Roman" w:cs="Times New Roman"/>
         </w:rPr>
       </w:pPr>
+      <w:proofErr w:type="spellStart"/>
       <w:r>
         <w:rPr>
           <w:rFonts w:ascii="Times New Roman" w:hAnsi="Times New Roman" w:cs="Times New Roman"/>
         </w:rPr>
         <w:t>person_emp_exp</w:t>
       </w:r>
+      <w:proofErr w:type="spellEnd"/>
     </w:p>
     <w:p>
       <w:pPr>
@@ -530,12 +560,14 @@
           <w:rFonts w:ascii="Times New Roman" w:hAnsi="Times New Roman" w:cs="Times New Roman"/>
         </w:rPr>
       </w:pPr>
+      <w:proofErr w:type="spellStart"/>
       <w:r>
         <w:rPr>
           <w:rFonts w:ascii="Times New Roman" w:hAnsi="Times New Roman" w:cs="Times New Roman"/>
         </w:rPr>
         <w:t>person_home_ownership</w:t>
       </w:r>
+      <w:proofErr w:type="spellEnd"/>
     </w:p>
     <w:p>
       <w:pPr>
@@ -548,12 +580,14 @@
           <w:rFonts w:ascii="Times New Roman" w:hAnsi="Times New Roman" w:cs="Times New Roman"/>
         </w:rPr>
       </w:pPr>
+      <w:proofErr w:type="spellStart"/>
       <w:r>
         <w:rPr>
           <w:rFonts w:ascii="Times New Roman" w:hAnsi="Times New Roman" w:cs="Times New Roman"/>
         </w:rPr>
         <w:t>loan_amnt</w:t>
       </w:r>
+      <w:proofErr w:type="spellEnd"/>
     </w:p>
     <w:p>
       <w:pPr>
@@ -566,12 +600,14 @@
           <w:rFonts w:ascii="Times New Roman" w:hAnsi="Times New Roman" w:cs="Times New Roman"/>
         </w:rPr>
       </w:pPr>
+      <w:proofErr w:type="spellStart"/>
       <w:r>
         <w:rPr>
           <w:rFonts w:ascii="Times New Roman" w:hAnsi="Times New Roman" w:cs="Times New Roman"/>
         </w:rPr>
         <w:t>loan_intent</w:t>
       </w:r>
+      <w:proofErr w:type="spellEnd"/>
     </w:p>
     <w:p>
       <w:pPr>
@@ -584,12 +620,14 @@
           <w:rFonts w:ascii="Times New Roman" w:hAnsi="Times New Roman" w:cs="Times New Roman"/>
         </w:rPr>
       </w:pPr>
+      <w:proofErr w:type="spellStart"/>
       <w:r>
         <w:rPr>
           <w:rFonts w:ascii="Times New Roman" w:hAnsi="Times New Roman" w:cs="Times New Roman"/>
         </w:rPr>
         <w:t>loan_int_rate</w:t>
       </w:r>
+      <w:proofErr w:type="spellEnd"/>
     </w:p>
     <w:p>
       <w:pPr>
@@ -602,12 +640,14 @@
           <w:rFonts w:ascii="Times New Roman" w:hAnsi="Times New Roman" w:cs="Times New Roman"/>
         </w:rPr>
       </w:pPr>
+      <w:proofErr w:type="spellStart"/>
       <w:r>
         <w:rPr>
           <w:rFonts w:ascii="Times New Roman" w:hAnsi="Times New Roman" w:cs="Times New Roman"/>
         </w:rPr>
         <w:t>loan_percent_income</w:t>
       </w:r>
+      <w:proofErr w:type="spellEnd"/>
     </w:p>
     <w:p>
       <w:pPr>
@@ -620,12 +660,14 @@
           <w:rFonts w:ascii="Times New Roman" w:hAnsi="Times New Roman" w:cs="Times New Roman"/>
         </w:rPr>
       </w:pPr>
+      <w:proofErr w:type="spellStart"/>
       <w:r>
         <w:rPr>
           <w:rFonts w:ascii="Times New Roman" w:hAnsi="Times New Roman" w:cs="Times New Roman"/>
         </w:rPr>
         <w:t>cb_person_cred_hist_length</w:t>
       </w:r>
+      <w:proofErr w:type="spellEnd"/>
     </w:p>
     <w:p>
       <w:pPr>
@@ -638,12 +680,14 @@
           <w:rFonts w:ascii="Times New Roman" w:hAnsi="Times New Roman" w:cs="Times New Roman"/>
         </w:rPr>
       </w:pPr>
+      <w:proofErr w:type="spellStart"/>
       <w:r>
         <w:rPr>
           <w:rFonts w:ascii="Times New Roman" w:hAnsi="Times New Roman" w:cs="Times New Roman"/>
         </w:rPr>
         <w:t>credit_score</w:t>
       </w:r>
+      <w:proofErr w:type="spellEnd"/>
     </w:p>
     <w:p>
       <w:pPr>
@@ -656,12 +700,14 @@
           <w:rFonts w:ascii="Times New Roman" w:hAnsi="Times New Roman" w:cs="Times New Roman"/>
         </w:rPr>
       </w:pPr>
+      <w:proofErr w:type="spellStart"/>
       <w:r>
         <w:rPr>
           <w:rFonts w:ascii="Times New Roman" w:hAnsi="Times New Roman" w:cs="Times New Roman"/>
         </w:rPr>
         <w:t>previous_loan_defaults_on_file</w:t>
       </w:r>
+      <w:proofErr w:type="spellEnd"/>
     </w:p>
     <w:p>
       <w:pPr>
@@ -674,11 +720,19 @@
           <w:rFonts w:ascii="Times New Roman" w:hAnsi="Times New Roman" w:cs="Times New Roman"/>
         </w:rPr>
       </w:pPr>
-      <w:r>
-        <w:rPr>
-          <w:rFonts w:ascii="Times New Roman" w:hAnsi="Times New Roman" w:cs="Times New Roman"/>
-        </w:rPr>
-        <w:t xml:space="preserve">loan_status </w:t>
+      <w:proofErr w:type="spellStart"/>
+      <w:r>
+        <w:rPr>
+          <w:rFonts w:ascii="Times New Roman" w:hAnsi="Times New Roman" w:cs="Times New Roman"/>
+        </w:rPr>
+        <w:t>loan_status</w:t>
+      </w:r>
+      <w:proofErr w:type="spellEnd"/>
+      <w:r>
+        <w:rPr>
+          <w:rFonts w:ascii="Times New Roman" w:hAnsi="Times New Roman" w:cs="Times New Roman"/>
+        </w:rPr>
+        <w:t xml:space="preserve"> </w:t>
       </w:r>
     </w:p>
     <w:p>
@@ -990,8 +1044,19 @@
           <w:iCs/>
           <w:color w:val="auto"/>
         </w:rPr>
-        <w:t>1. person_age</w:t>
-      </w:r>
+        <w:t xml:space="preserve">1. </w:t>
+      </w:r>
+      <w:proofErr w:type="spellStart"/>
+      <w:r>
+        <w:rPr>
+          <w:rFonts w:ascii="Times New Roman" w:hAnsi="Times New Roman" w:cs="Times New Roman"/>
+          <w:i/>
+          <w:iCs/>
+          <w:color w:val="auto"/>
+        </w:rPr>
+        <w:t>person_age</w:t>
+      </w:r>
+      <w:proofErr w:type="spellEnd"/>
     </w:p>
     <w:p>
       <w:pPr>
@@ -1070,8 +1135,19 @@
           <w:iCs/>
           <w:color w:val="auto"/>
         </w:rPr>
-        <w:t>2. person_income</w:t>
-      </w:r>
+        <w:t xml:space="preserve">2. </w:t>
+      </w:r>
+      <w:proofErr w:type="spellStart"/>
+      <w:r>
+        <w:rPr>
+          <w:rFonts w:ascii="Times New Roman" w:hAnsi="Times New Roman" w:cs="Times New Roman"/>
+          <w:i/>
+          <w:iCs/>
+          <w:color w:val="auto"/>
+        </w:rPr>
+        <w:t>person_income</w:t>
+      </w:r>
+      <w:proofErr w:type="spellEnd"/>
     </w:p>
     <w:p>
       <w:pPr>
@@ -1150,8 +1226,19 @@
           <w:iCs/>
           <w:color w:val="auto"/>
         </w:rPr>
-        <w:t>3. person_emp_exp</w:t>
-      </w:r>
+        <w:t xml:space="preserve">3. </w:t>
+      </w:r>
+      <w:proofErr w:type="spellStart"/>
+      <w:r>
+        <w:rPr>
+          <w:rFonts w:ascii="Times New Roman" w:hAnsi="Times New Roman" w:cs="Times New Roman"/>
+          <w:i/>
+          <w:iCs/>
+          <w:color w:val="auto"/>
+        </w:rPr>
+        <w:t>person_emp_exp</w:t>
+      </w:r>
+      <w:proofErr w:type="spellEnd"/>
     </w:p>
     <w:p>
       <w:pPr>
@@ -1230,8 +1317,19 @@
           <w:iCs/>
           <w:color w:val="auto"/>
         </w:rPr>
-        <w:t>4. loan_amnt</w:t>
-      </w:r>
+        <w:t xml:space="preserve">4. </w:t>
+      </w:r>
+      <w:proofErr w:type="spellStart"/>
+      <w:r>
+        <w:rPr>
+          <w:rFonts w:ascii="Times New Roman" w:hAnsi="Times New Roman" w:cs="Times New Roman"/>
+          <w:i/>
+          <w:iCs/>
+          <w:color w:val="auto"/>
+        </w:rPr>
+        <w:t>loan_amnt</w:t>
+      </w:r>
+      <w:proofErr w:type="spellEnd"/>
     </w:p>
     <w:p>
       <w:pPr>
@@ -1311,8 +1409,19 @@
           <w:color w:val="auto"/>
         </w:rPr>
         <w:lastRenderedPageBreak/>
-        <w:t>5. loan_int_rate</w:t>
-      </w:r>
+        <w:t xml:space="preserve">5. </w:t>
+      </w:r>
+      <w:proofErr w:type="spellStart"/>
+      <w:r>
+        <w:rPr>
+          <w:rFonts w:ascii="Times New Roman" w:hAnsi="Times New Roman" w:cs="Times New Roman"/>
+          <w:i/>
+          <w:iCs/>
+          <w:color w:val="auto"/>
+        </w:rPr>
+        <w:t>loan_int_rate</w:t>
+      </w:r>
+      <w:proofErr w:type="spellEnd"/>
     </w:p>
     <w:p>
       <w:pPr>
@@ -1391,8 +1500,19 @@
           <w:iCs/>
           <w:color w:val="auto"/>
         </w:rPr>
-        <w:t>6. loan_percent_income</w:t>
-      </w:r>
+        <w:t xml:space="preserve">6. </w:t>
+      </w:r>
+      <w:proofErr w:type="spellStart"/>
+      <w:r>
+        <w:rPr>
+          <w:rFonts w:ascii="Times New Roman" w:hAnsi="Times New Roman" w:cs="Times New Roman"/>
+          <w:i/>
+          <w:iCs/>
+          <w:color w:val="auto"/>
+        </w:rPr>
+        <w:t>loan_percent_income</w:t>
+      </w:r>
+      <w:proofErr w:type="spellEnd"/>
     </w:p>
     <w:p>
       <w:pPr>
@@ -1471,8 +1591,19 @@
           <w:iCs/>
           <w:color w:val="auto"/>
         </w:rPr>
-        <w:t>7. cb_person_cred_hist_length</w:t>
-      </w:r>
+        <w:t xml:space="preserve">7. </w:t>
+      </w:r>
+      <w:proofErr w:type="spellStart"/>
+      <w:r>
+        <w:rPr>
+          <w:rFonts w:ascii="Times New Roman" w:hAnsi="Times New Roman" w:cs="Times New Roman"/>
+          <w:i/>
+          <w:iCs/>
+          <w:color w:val="auto"/>
+        </w:rPr>
+        <w:t>cb_person_cred_hist_length</w:t>
+      </w:r>
+      <w:proofErr w:type="spellEnd"/>
     </w:p>
     <w:p>
       <w:pPr>
@@ -1551,8 +1682,19 @@
           <w:iCs/>
           <w:color w:val="auto"/>
         </w:rPr>
-        <w:t>8. credit_score</w:t>
-      </w:r>
+        <w:t xml:space="preserve">8. </w:t>
+      </w:r>
+      <w:proofErr w:type="spellStart"/>
+      <w:r>
+        <w:rPr>
+          <w:rFonts w:ascii="Times New Roman" w:hAnsi="Times New Roman" w:cs="Times New Roman"/>
+          <w:i/>
+          <w:iCs/>
+          <w:color w:val="auto"/>
+        </w:rPr>
+        <w:t>credit_score</w:t>
+      </w:r>
+      <w:proofErr w:type="spellEnd"/>
     </w:p>
     <w:p>
       <w:pPr>
@@ -1645,6 +1787,7 @@
           <w:szCs w:val="28"/>
         </w:rPr>
       </w:pPr>
+      <w:proofErr w:type="spellStart"/>
       <w:r>
         <w:rPr>
           <w:rFonts w:ascii="Times New Roman" w:hAnsi="Times New Roman" w:cs="Times New Roman"/>
@@ -1655,6 +1798,7 @@
         </w:rPr>
         <w:t>person_gender</w:t>
       </w:r>
+      <w:proofErr w:type="spellEnd"/>
     </w:p>
     <w:p>
       <w:pPr>
@@ -1687,6 +1831,7 @@
           <w:szCs w:val="28"/>
         </w:rPr>
       </w:pPr>
+      <w:proofErr w:type="spellStart"/>
       <w:r>
         <w:rPr>
           <w:rFonts w:ascii="Times New Roman" w:hAnsi="Times New Roman" w:cs="Times New Roman"/>
@@ -1697,6 +1842,7 @@
         </w:rPr>
         <w:t>person_education</w:t>
       </w:r>
+      <w:proofErr w:type="spellEnd"/>
     </w:p>
     <w:p>
       <w:pPr>
@@ -1729,6 +1875,7 @@
           <w:szCs w:val="28"/>
         </w:rPr>
       </w:pPr>
+      <w:proofErr w:type="spellStart"/>
       <w:r>
         <w:rPr>
           <w:rFonts w:ascii="Times New Roman" w:hAnsi="Times New Roman" w:cs="Times New Roman"/>
@@ -1739,6 +1886,7 @@
         </w:rPr>
         <w:t>person_home_ownership</w:t>
       </w:r>
+      <w:proofErr w:type="spellEnd"/>
     </w:p>
     <w:p>
       <w:pPr>
@@ -1771,6 +1919,7 @@
           <w:szCs w:val="28"/>
         </w:rPr>
       </w:pPr>
+      <w:proofErr w:type="spellStart"/>
       <w:r>
         <w:rPr>
           <w:rFonts w:ascii="Times New Roman" w:hAnsi="Times New Roman" w:cs="Times New Roman"/>
@@ -1782,6 +1931,7 @@
         <w:lastRenderedPageBreak/>
         <w:t>loan_intent</w:t>
       </w:r>
+      <w:proofErr w:type="spellEnd"/>
     </w:p>
     <w:p>
       <w:pPr>
@@ -1814,6 +1964,7 @@
           <w:szCs w:val="28"/>
         </w:rPr>
       </w:pPr>
+      <w:proofErr w:type="spellStart"/>
       <w:r>
         <w:rPr>
           <w:rFonts w:ascii="Times New Roman" w:hAnsi="Times New Roman" w:cs="Times New Roman"/>
@@ -1824,6 +1975,7 @@
         </w:rPr>
         <w:t>previous_loan_defaults_on_file</w:t>
       </w:r>
+      <w:proofErr w:type="spellEnd"/>
     </w:p>
     <w:p>
       <w:pPr>
@@ -1856,6 +2008,7 @@
           <w:szCs w:val="28"/>
         </w:rPr>
       </w:pPr>
+      <w:proofErr w:type="spellStart"/>
       <w:r>
         <w:rPr>
           <w:rFonts w:ascii="Times New Roman" w:hAnsi="Times New Roman" w:cs="Times New Roman"/>
@@ -1866,6 +2019,7 @@
         </w:rPr>
         <w:t>loan_status</w:t>
       </w:r>
+      <w:proofErr w:type="spellEnd"/>
     </w:p>
     <w:p>
       <w:pPr>
@@ -2033,6 +2187,7 @@
         </w:rPr>
         <w:t xml:space="preserve"> </w:t>
       </w:r>
+      <w:proofErr w:type="spellStart"/>
       <w:r>
         <w:rPr>
           <w:rFonts w:ascii="Times New Roman" w:hAnsi="Times New Roman" w:cs="Times New Roman"/>
@@ -2042,7 +2197,19 @@
           <w:sz w:val="28"/>
           <w:szCs w:val="28"/>
         </w:rPr>
-        <w:t xml:space="preserve">person_age </w:t>
+        <w:t>person_age</w:t>
+      </w:r>
+      <w:proofErr w:type="spellEnd"/>
+      <w:r>
+        <w:rPr>
+          <w:rFonts w:ascii="Times New Roman" w:hAnsi="Times New Roman" w:cs="Times New Roman"/>
+          <w:b/>
+          <w:bCs/>
+          <w:color w:val="000000"/>
+          <w:sz w:val="28"/>
+          <w:szCs w:val="28"/>
+        </w:rPr>
+        <w:t xml:space="preserve"> </w:t>
       </w:r>
     </w:p>
     <w:p>
@@ -2362,7 +2529,31 @@
           <w:sz w:val="28"/>
           <w:szCs w:val="28"/>
         </w:rPr>
-        <w:t xml:space="preserve">Column Name: person_income </w:t>
+        <w:t xml:space="preserve">Column Name: </w:t>
+      </w:r>
+      <w:proofErr w:type="spellStart"/>
+      <w:r>
+        <w:rPr>
+          <w:rFonts w:ascii="Times New Roman" w:hAnsi="Times New Roman" w:cs="Times New Roman"/>
+          <w:b/>
+          <w:bCs/>
+          <w:color w:val="000000"/>
+          <w:sz w:val="28"/>
+          <w:szCs w:val="28"/>
+        </w:rPr>
+        <w:t>person_income</w:t>
+      </w:r>
+      <w:proofErr w:type="spellEnd"/>
+      <w:r>
+        <w:rPr>
+          <w:rFonts w:ascii="Times New Roman" w:hAnsi="Times New Roman" w:cs="Times New Roman"/>
+          <w:b/>
+          <w:bCs/>
+          <w:color w:val="000000"/>
+          <w:sz w:val="28"/>
+          <w:szCs w:val="28"/>
+        </w:rPr>
+        <w:t xml:space="preserve"> </w:t>
       </w:r>
     </w:p>
     <w:p>
@@ -2636,7 +2827,31 @@
           <w:sz w:val="28"/>
           <w:szCs w:val="28"/>
         </w:rPr>
-        <w:t xml:space="preserve">Column Name: person_emp_exp </w:t>
+        <w:t xml:space="preserve">Column Name: </w:t>
+      </w:r>
+      <w:proofErr w:type="spellStart"/>
+      <w:r>
+        <w:rPr>
+          <w:rFonts w:ascii="Times New Roman" w:hAnsi="Times New Roman" w:cs="Times New Roman"/>
+          <w:b/>
+          <w:bCs/>
+          <w:color w:val="000000"/>
+          <w:sz w:val="28"/>
+          <w:szCs w:val="28"/>
+        </w:rPr>
+        <w:t>person_emp_exp</w:t>
+      </w:r>
+      <w:proofErr w:type="spellEnd"/>
+      <w:r>
+        <w:rPr>
+          <w:rFonts w:ascii="Times New Roman" w:hAnsi="Times New Roman" w:cs="Times New Roman"/>
+          <w:b/>
+          <w:bCs/>
+          <w:color w:val="000000"/>
+          <w:sz w:val="28"/>
+          <w:szCs w:val="28"/>
+        </w:rPr>
+        <w:t xml:space="preserve"> </w:t>
       </w:r>
     </w:p>
     <w:p>
@@ -2920,7 +3135,31 @@
           <w:sz w:val="28"/>
           <w:szCs w:val="28"/>
         </w:rPr>
-        <w:t xml:space="preserve">Column Name: loan_amnt </w:t>
+        <w:t xml:space="preserve">Column Name: </w:t>
+      </w:r>
+      <w:proofErr w:type="spellStart"/>
+      <w:r>
+        <w:rPr>
+          <w:rFonts w:ascii="Times New Roman" w:hAnsi="Times New Roman" w:cs="Times New Roman"/>
+          <w:b/>
+          <w:bCs/>
+          <w:color w:val="000000"/>
+          <w:sz w:val="28"/>
+          <w:szCs w:val="28"/>
+        </w:rPr>
+        <w:t>loan_amnt</w:t>
+      </w:r>
+      <w:proofErr w:type="spellEnd"/>
+      <w:r>
+        <w:rPr>
+          <w:rFonts w:ascii="Times New Roman" w:hAnsi="Times New Roman" w:cs="Times New Roman"/>
+          <w:b/>
+          <w:bCs/>
+          <w:color w:val="000000"/>
+          <w:sz w:val="28"/>
+          <w:szCs w:val="28"/>
+        </w:rPr>
+        <w:t xml:space="preserve"> </w:t>
       </w:r>
     </w:p>
     <w:p>
@@ -3187,7 +3426,31 @@
           <w:szCs w:val="28"/>
         </w:rPr>
         <w:lastRenderedPageBreak/>
-        <w:t xml:space="preserve">Column Name: loan_int_rate </w:t>
+        <w:t xml:space="preserve">Column Name: </w:t>
+      </w:r>
+      <w:proofErr w:type="spellStart"/>
+      <w:r>
+        <w:rPr>
+          <w:rFonts w:ascii="Times New Roman" w:hAnsi="Times New Roman" w:cs="Times New Roman"/>
+          <w:b/>
+          <w:bCs/>
+          <w:color w:val="000000"/>
+          <w:sz w:val="28"/>
+          <w:szCs w:val="28"/>
+        </w:rPr>
+        <w:t>loan_int_rate</w:t>
+      </w:r>
+      <w:proofErr w:type="spellEnd"/>
+      <w:r>
+        <w:rPr>
+          <w:rFonts w:ascii="Times New Roman" w:hAnsi="Times New Roman" w:cs="Times New Roman"/>
+          <w:b/>
+          <w:bCs/>
+          <w:color w:val="000000"/>
+          <w:sz w:val="28"/>
+          <w:szCs w:val="28"/>
+        </w:rPr>
+        <w:t xml:space="preserve"> </w:t>
       </w:r>
     </w:p>
     <w:p>
@@ -3483,7 +3746,31 @@
           <w:sz w:val="28"/>
           <w:szCs w:val="28"/>
         </w:rPr>
-        <w:t xml:space="preserve">Column Name: loan_percent_income </w:t>
+        <w:t xml:space="preserve">Column Name: </w:t>
+      </w:r>
+      <w:proofErr w:type="spellStart"/>
+      <w:r>
+        <w:rPr>
+          <w:rFonts w:ascii="Times New Roman" w:hAnsi="Times New Roman" w:cs="Times New Roman"/>
+          <w:b/>
+          <w:bCs/>
+          <w:color w:val="000000"/>
+          <w:sz w:val="28"/>
+          <w:szCs w:val="28"/>
+        </w:rPr>
+        <w:t>loan_percent_income</w:t>
+      </w:r>
+      <w:proofErr w:type="spellEnd"/>
+      <w:r>
+        <w:rPr>
+          <w:rFonts w:ascii="Times New Roman" w:hAnsi="Times New Roman" w:cs="Times New Roman"/>
+          <w:b/>
+          <w:bCs/>
+          <w:color w:val="000000"/>
+          <w:sz w:val="28"/>
+          <w:szCs w:val="28"/>
+        </w:rPr>
+        <w:t xml:space="preserve"> </w:t>
       </w:r>
     </w:p>
     <w:p>
@@ -3789,7 +4076,31 @@
           <w:sz w:val="28"/>
           <w:szCs w:val="28"/>
         </w:rPr>
-        <w:t xml:space="preserve">Column Name: cb_person_cred_hist_length </w:t>
+        <w:t xml:space="preserve">Column Name: </w:t>
+      </w:r>
+      <w:proofErr w:type="spellStart"/>
+      <w:r>
+        <w:rPr>
+          <w:rFonts w:ascii="Times New Roman" w:hAnsi="Times New Roman" w:cs="Times New Roman"/>
+          <w:b/>
+          <w:bCs/>
+          <w:color w:val="000000"/>
+          <w:sz w:val="28"/>
+          <w:szCs w:val="28"/>
+        </w:rPr>
+        <w:t>cb_person_cred_hist_length</w:t>
+      </w:r>
+      <w:proofErr w:type="spellEnd"/>
+      <w:r>
+        <w:rPr>
+          <w:rFonts w:ascii="Times New Roman" w:hAnsi="Times New Roman" w:cs="Times New Roman"/>
+          <w:b/>
+          <w:bCs/>
+          <w:color w:val="000000"/>
+          <w:sz w:val="28"/>
+          <w:szCs w:val="28"/>
+        </w:rPr>
+        <w:t xml:space="preserve"> </w:t>
       </w:r>
     </w:p>
     <w:p>
@@ -3872,19 +4183,29 @@
           <w:color w:val="000000"/>
         </w:rPr>
       </w:pPr>
+    </w:p>
+    <w:p>
+      <w:pPr>
+        <w:pStyle w:val="PreformattedText"/>
+        <w:spacing w:line="255" w:lineRule="atLeast"/>
+        <w:rPr>
+          <w:rFonts w:ascii="Times New Roman" w:hAnsi="Times New Roman" w:cs="Times New Roman"/>
+          <w:color w:val="000000"/>
+        </w:rPr>
+      </w:pPr>
       <w:r>
         <w:rPr>
           <w:rFonts w:ascii="Times New Roman" w:hAnsi="Times New Roman" w:cs="Times New Roman"/>
           <w:noProof/>
         </w:rPr>
         <w:drawing>
-          <wp:anchor distT="0" distB="0" distL="0" distR="0" simplePos="0" relativeHeight="251687424" behindDoc="1" locked="0" layoutInCell="0" allowOverlap="1" wp14:anchorId="341F9677" wp14:editId="5B0086CE">
+          <wp:anchor distT="0" distB="0" distL="0" distR="0" simplePos="0" relativeHeight="251687424" behindDoc="1" locked="0" layoutInCell="0" allowOverlap="1" wp14:anchorId="341F9677" wp14:editId="0F60E3AF">
             <wp:simplePos x="0" y="0"/>
             <wp:positionH relativeFrom="column">
-              <wp:posOffset>730250</wp:posOffset>
+              <wp:posOffset>698500</wp:posOffset>
             </wp:positionH>
             <wp:positionV relativeFrom="paragraph">
-              <wp:posOffset>-164465</wp:posOffset>
+              <wp:posOffset>22860</wp:posOffset>
             </wp:positionV>
             <wp:extent cx="4113530" cy="1847850"/>
             <wp:effectExtent l="0" t="0" r="0" b="0"/>
@@ -3936,16 +4257,6 @@
           </wp:anchor>
         </w:drawing>
       </w:r>
-    </w:p>
-    <w:p>
-      <w:pPr>
-        <w:pStyle w:val="PreformattedText"/>
-        <w:spacing w:line="255" w:lineRule="atLeast"/>
-        <w:rPr>
-          <w:rFonts w:ascii="Times New Roman" w:hAnsi="Times New Roman" w:cs="Times New Roman"/>
-          <w:color w:val="000000"/>
-        </w:rPr>
-      </w:pPr>
       <w:r>
         <w:rPr>
           <w:rFonts w:ascii="Times New Roman" w:hAnsi="Times New Roman" w:cs="Times New Roman"/>
@@ -3976,7 +4287,31 @@
           <w:sz w:val="28"/>
           <w:szCs w:val="28"/>
         </w:rPr>
-        <w:t xml:space="preserve">Column Name: credit_score </w:t>
+        <w:t xml:space="preserve">Column Name: </w:t>
+      </w:r>
+      <w:proofErr w:type="spellStart"/>
+      <w:r>
+        <w:rPr>
+          <w:rFonts w:ascii="Times New Roman" w:hAnsi="Times New Roman" w:cs="Times New Roman"/>
+          <w:b/>
+          <w:bCs/>
+          <w:color w:val="000000"/>
+          <w:sz w:val="28"/>
+          <w:szCs w:val="28"/>
+        </w:rPr>
+        <w:t>credit_score</w:t>
+      </w:r>
+      <w:proofErr w:type="spellEnd"/>
+      <w:r>
+        <w:rPr>
+          <w:rFonts w:ascii="Times New Roman" w:hAnsi="Times New Roman" w:cs="Times New Roman"/>
+          <w:b/>
+          <w:bCs/>
+          <w:color w:val="000000"/>
+          <w:sz w:val="28"/>
+          <w:szCs w:val="28"/>
+        </w:rPr>
+        <w:t xml:space="preserve"> </w:t>
       </w:r>
     </w:p>
     <w:p>
@@ -4225,6 +4560,7 @@
         </w:rPr>
         <w:t>&gt;</w:t>
       </w:r>
+      <w:proofErr w:type="spellStart"/>
       <w:r>
         <w:rPr>
           <w:rFonts w:ascii="Times New Roman" w:hAnsi="Times New Roman" w:cs="Times New Roman"/>
@@ -4235,6 +4571,7 @@
         </w:rPr>
         <w:t>person_age</w:t>
       </w:r>
+      <w:proofErr w:type="spellEnd"/>
     </w:p>
     <w:p>
       <w:pPr>
@@ -4282,6 +4619,7 @@
         </w:rPr>
         <w:t>&gt;</w:t>
       </w:r>
+      <w:proofErr w:type="spellStart"/>
       <w:r>
         <w:rPr>
           <w:rFonts w:ascii="Times New Roman" w:hAnsi="Times New Roman" w:cs="Times New Roman"/>
@@ -4292,6 +4630,7 @@
         </w:rPr>
         <w:t>person_income</w:t>
       </w:r>
+      <w:proofErr w:type="spellEnd"/>
     </w:p>
     <w:p>
       <w:pPr>
@@ -4339,6 +4678,7 @@
         </w:rPr>
         <w:t>&gt;</w:t>
       </w:r>
+      <w:proofErr w:type="spellStart"/>
       <w:r>
         <w:rPr>
           <w:rFonts w:ascii="Times New Roman" w:hAnsi="Times New Roman" w:cs="Times New Roman"/>
@@ -4349,6 +4689,7 @@
         </w:rPr>
         <w:t>person_emp_exp</w:t>
       </w:r>
+      <w:proofErr w:type="spellEnd"/>
     </w:p>
     <w:p>
       <w:pPr>
@@ -4396,6 +4737,7 @@
         </w:rPr>
         <w:t>&gt;</w:t>
       </w:r>
+      <w:proofErr w:type="spellStart"/>
       <w:r>
         <w:rPr>
           <w:rFonts w:ascii="Times New Roman" w:hAnsi="Times New Roman" w:cs="Times New Roman"/>
@@ -4406,6 +4748,7 @@
         </w:rPr>
         <w:t>loan_amnt</w:t>
       </w:r>
+      <w:proofErr w:type="spellEnd"/>
     </w:p>
     <w:p>
       <w:pPr>
@@ -4462,6 +4805,7 @@
         </w:rPr>
         <w:t>&gt;</w:t>
       </w:r>
+      <w:proofErr w:type="spellStart"/>
       <w:r>
         <w:rPr>
           <w:rFonts w:ascii="Times New Roman" w:hAnsi="Times New Roman" w:cs="Times New Roman"/>
@@ -4472,6 +4816,7 @@
         </w:rPr>
         <w:t>loan_int_rate</w:t>
       </w:r>
+      <w:proofErr w:type="spellEnd"/>
     </w:p>
     <w:p>
       <w:pPr>
@@ -4527,6 +4872,7 @@
         </w:rPr>
         <w:t>&gt;</w:t>
       </w:r>
+      <w:proofErr w:type="spellStart"/>
       <w:r>
         <w:rPr>
           <w:rFonts w:ascii="Times New Roman" w:hAnsi="Times New Roman" w:cs="Times New Roman"/>
@@ -4537,15 +4883,17 @@
         </w:rPr>
         <w:t>loan_percent_income</w:t>
       </w:r>
-    </w:p>
-    <w:p>
-      <w:pPr>
-        <w:rPr>
-          <w:rFonts w:ascii="Times New Roman" w:hAnsi="Times New Roman" w:cs="Times New Roman"/>
-          <w:sz w:val="28"/>
-          <w:szCs w:val="28"/>
-        </w:rPr>
-      </w:pPr>
+      <w:proofErr w:type="spellEnd"/>
+    </w:p>
+    <w:p>
+      <w:pPr>
+        <w:rPr>
+          <w:rFonts w:ascii="Times New Roman" w:hAnsi="Times New Roman" w:cs="Times New Roman"/>
+          <w:sz w:val="28"/>
+          <w:szCs w:val="28"/>
+        </w:rPr>
+      </w:pPr>
+      <w:proofErr w:type="spellStart"/>
       <w:r>
         <w:rPr>
           <w:rStyle w:val="Strong"/>
@@ -4553,6 +4901,7 @@
         </w:rPr>
         <w:t>loan_percent_income</w:t>
       </w:r>
+      <w:proofErr w:type="spellEnd"/>
       <w:r>
         <w:rPr>
           <w:rFonts w:ascii="Times New Roman" w:hAnsi="Times New Roman" w:cs="Times New Roman"/>
@@ -4603,6 +4952,7 @@
         </w:rPr>
         <w:t>&gt;</w:t>
       </w:r>
+      <w:proofErr w:type="spellStart"/>
       <w:r>
         <w:rPr>
           <w:rFonts w:ascii="Times New Roman" w:hAnsi="Times New Roman" w:cs="Times New Roman"/>
@@ -4613,6 +4963,7 @@
         </w:rPr>
         <w:t>cb_person_cred_hist_length</w:t>
       </w:r>
+      <w:proofErr w:type="spellEnd"/>
     </w:p>
     <w:p>
       <w:pPr>
@@ -4668,6 +5019,7 @@
         </w:rPr>
         <w:t>&gt;</w:t>
       </w:r>
+      <w:proofErr w:type="spellStart"/>
       <w:r>
         <w:rPr>
           <w:rFonts w:ascii="Times New Roman" w:hAnsi="Times New Roman" w:cs="Times New Roman"/>
@@ -4678,6 +5030,7 @@
         </w:rPr>
         <w:t>credit_score</w:t>
       </w:r>
+      <w:proofErr w:type="spellEnd"/>
     </w:p>
     <w:p>
       <w:pPr>
@@ -10001,6 +10354,7 @@
     <w:rsid w:val="005329DC"/>
     <w:rsid w:val="005C0728"/>
     <w:rsid w:val="0064411B"/>
+    <w:rsid w:val="00856B7F"/>
     <w:rsid w:val="008E111F"/>
     <w:rsid w:val="009A2CB6"/>
     <w:rsid w:val="00A12AC5"/>

</xml_diff>